<commit_message>
Add admin-controlled workshop attendance confirmation
</commit_message>
<xml_diff>
--- a/docs/Participant-Certificate-and-Receipt-Manual.docx
+++ b/docs/Participant-Certificate-and-Receipt-Manual.docx
@@ -157,7 +157,7 @@
                 <w:color w:val="0B2545"/>
                 <w:sz w:val="21"/>
               </w:rPr>
-              <w:t>After completion + approval</w:t>
+              <w:t>After attendance + approval</w:t>
             </w:r>
           </w:p>
         </w:tc>
@@ -276,7 +276,7 @@
                 <w:color w:val="1F2937"/>
                 <w:sz w:val="22"/>
               </w:rPr>
-              <w:t>Workshop certificates require an application. After the workshop is marked completed, open Certificates &amp; Receipts, apply for that specific workshop, and wait for admin approval.</w:t>
+              <w:t>Workshop certificates require an application. After the admin confirms your registration and marks Attendance as Attended in Registration Management, open Certificates &amp; Receipts, apply for that workshop, and wait for approval.</w:t>
             </w:r>
           </w:p>
         </w:tc>
@@ -546,7 +546,7 @@
                 <w:color w:val="1F2937"/>
                 <w:sz w:val="21"/>
               </w:rPr>
-              <w:t>Complete every published course lesson, or attend the workshop and wait for the admin to mark your participation completed.</w:t>
+              <w:t>Complete every published course lesson, or attend the workshop and wait for the admin to confirm your attendance in Registration Management.</w:t>
             </w:r>
           </w:p>
         </w:tc>
@@ -633,7 +633,7 @@
                 <w:color w:val="1F2937"/>
                 <w:sz w:val="21"/>
               </w:rPr>
-              <w:t>Open Certificates &amp; Receipts, select the completed workshop, confirm the exact printed name, and submit the application.</w:t>
+              <w:t>When the eligible workshop appears in Certificates &amp; Receipts, confirm the exact printed name and submit the application.</w:t>
             </w:r>
           </w:p>
         </w:tc>
@@ -1722,7 +1722,7 @@
           <w:color w:val="1F2937"/>
           <w:sz w:val="22"/>
         </w:rPr>
-        <w:t>Attend the workshop and meet the organizer's participation or completion requirements. After an admin marks your registration completed, an application form appears under Certificates &amp; Receipts. Select that workshop, confirm your preferred printed name, add an optional note, and submit the application.</w:t>
+        <w:t>Attend the workshop and meet the organizer's participation requirements. In Registration Management, the admin keeps your registration status as Confirmed and separately changes Attendance from Not confirmed to Attended. Only then does the application form appear under Certificates &amp; Receipts. Select the workshop, confirm your preferred printed name, add an optional note, and submit the application.</w:t>
       </w:r>
     </w:p>
     <w:p>
@@ -1810,7 +1810,7 @@
                 <w:color w:val="1F2937"/>
                 <w:sz w:val="21"/>
               </w:rPr>
-              <w:t>The application status becomes Pending. It is tied to your completed registration for that specific workshop.</w:t>
+              <w:t>The application status becomes Pending. It is tied to your confirmed registration and admin-confirmed attendance for that specific workshop.</w:t>
             </w:r>
           </w:p>
         </w:tc>
@@ -1897,7 +1897,7 @@
                 <w:color w:val="1F2937"/>
                 <w:sz w:val="21"/>
               </w:rPr>
-              <w:t>The admin confirms completion, participant identity, preferred name, workshop, issuing jurisdiction, and active certificate template.</w:t>
+              <w:t>The admin checks confirmed registration, Attended status, participant identity, preferred name, workshop, issuing jurisdiction, and the active certificate template.</w:t>
             </w:r>
           </w:p>
         </w:tc>
@@ -2038,7 +2038,7 @@
                 <w:color w:val="1F2937"/>
                 <w:sz w:val="22"/>
               </w:rPr>
-              <w:t>Workshop completion makes you eligible, but it does not issue the certificate by itself. Submit the application for that workshop. If it remains pending after the normal review period, contact support through Dashboard &gt; Messages.</w:t>
+              <w:t>Confirmed registration alone does not show the Apply button. Admin-confirmed attendance makes the workshop eligible, but it does not issue the certificate by itself. Submit the application for that workshop. If it remains pending after the normal review period, contact support through Dashboard &gt; Messages.</w:t>
             </w:r>
           </w:p>
         </w:tc>
@@ -2684,6 +2684,52 @@
                 <w:color w:val="1F2937"/>
                 <w:sz w:val="20"/>
               </w:rPr>
+              <w:t>Apply button not visible</w:t>
+            </w:r>
+          </w:p>
+        </w:tc>
+        <w:tc>
+          <w:tcPr>
+            <w:tcW w:type="dxa" w:w="6360"/>
+            <w:tcMar>
+              <w:top w:w="80" w:type="dxa"/>
+              <w:start w:w="120" w:type="dxa"/>
+              <w:bottom w:w="80" w:type="dxa"/>
+              <w:end w:w="120" w:type="dxa"/>
+            </w:tcMar>
+            <w:vAlign w:val="center"/>
+          </w:tcPr>
+          <w:p>
+            <w:r>
+              <w:rPr>
+                <w:rFonts w:ascii="Calibri" w:hAnsi="Calibri"/>
+                <w:color w:val="1F2937"/>
+                <w:sz w:val="20"/>
+              </w:rPr>
+              <w:t>A confirmed registration is not enough. Wait for the admin to set Attendance to Attended in Registration Management, then refresh Certificates &amp; Receipts.</w:t>
+            </w:r>
+          </w:p>
+        </w:tc>
+      </w:tr>
+      <w:tr>
+        <w:tc>
+          <w:tcPr>
+            <w:tcW w:type="dxa" w:w="3000"/>
+            <w:tcMar>
+              <w:top w:w="80" w:type="dxa"/>
+              <w:start w:w="120" w:type="dxa"/>
+              <w:bottom w:w="80" w:type="dxa"/>
+              <w:end w:w="120" w:type="dxa"/>
+            </w:tcMar>
+            <w:vAlign w:val="center"/>
+          </w:tcPr>
+          <w:p>
+            <w:r>
+              <w:rPr>
+                <w:rFonts w:ascii="Calibri" w:hAnsi="Calibri"/>
+                <w:color w:val="1F2937"/>
+                <w:sz w:val="20"/>
+              </w:rPr>
               <w:t>Certificate still pending</w:t>
             </w:r>
           </w:p>
@@ -2706,7 +2752,7 @@
                 <w:color w:val="1F2937"/>
                 <w:sz w:val="20"/>
               </w:rPr>
-              <w:t>Confirm every lesson is complete, or wait for workshop attendance to be marked completed. Then contact support if needed.</w:t>
+              <w:t>Confirm every course lesson is complete, or check that workshop attendance is marked Attended. Then contact support if needed.</w:t>
             </w:r>
           </w:p>
         </w:tc>

</xml_diff>